<commit_message>
reimplemented time system & added inertia to MMB scroll
</commit_message>
<xml_diff>
--- a/Notes/BSc -Project Proposal Form 25-26.docx
+++ b/Notes/BSc -Project Proposal Form 25-26.docx
@@ -1596,20 +1596,8 @@
                 <w:sz w:val="24"/>
                 <w:szCs w:val="20"/>
               </w:rPr>
-              <w:t xml:space="preserve">V </w:t>
-            </w:r>
-            <w:proofErr w:type="spellStart"/>
-            <w:r>
-              <w:rPr>
-                <w:rFonts w:ascii="Arial" w:eastAsia="Times New Roman" w:hAnsi="Arial" w:cs="Arial"/>
-                <w:bCs/>
-                <w:spacing w:val="-5"/>
-                <w:sz w:val="24"/>
-                <w:szCs w:val="20"/>
-              </w:rPr>
-              <w:t>Lehdonvirta</w:t>
-            </w:r>
-            <w:proofErr w:type="spellEnd"/>
+              <w:t>V Lehdonvirta</w:t>
+            </w:r>
             <w:r>
               <w:rPr>
                 <w:rFonts w:ascii="Arial" w:eastAsia="Times New Roman" w:hAnsi="Arial" w:cs="Arial"/>
@@ -1687,7 +1675,6 @@
               </w:rPr>
               <w:t xml:space="preserve"> </w:t>
             </w:r>
-            <w:proofErr w:type="spellStart"/>
             <w:r>
               <w:rPr>
                 <w:rFonts w:ascii="Arial" w:eastAsia="Times New Roman" w:hAnsi="Arial" w:cs="Arial"/>
@@ -1698,7 +1685,6 @@
               </w:rPr>
               <w:t>Visonà</w:t>
             </w:r>
-            <w:proofErr w:type="spellEnd"/>
             <w:r>
               <w:rPr>
                 <w:rFonts w:ascii="Arial" w:eastAsia="Times New Roman" w:hAnsi="Arial" w:cs="Arial"/>
@@ -1717,17 +1703,7 @@
                 <w:sz w:val="24"/>
                 <w:szCs w:val="20"/>
               </w:rPr>
-              <w:t xml:space="preserve"> </w:t>
-            </w:r>
-            <w:r>
-              <w:rPr>
-                <w:rFonts w:ascii="Arial" w:eastAsia="Times New Roman" w:hAnsi="Arial" w:cs="Arial"/>
-                <w:bCs/>
-                <w:spacing w:val="-5"/>
-                <w:sz w:val="24"/>
-                <w:szCs w:val="20"/>
-              </w:rPr>
-              <w:t>L</w:t>
+              <w:t xml:space="preserve"> L</w:t>
             </w:r>
             <w:r>
               <w:rPr>
@@ -1915,47 +1891,17 @@
                 <w:sz w:val="24"/>
                 <w:szCs w:val="20"/>
               </w:rPr>
-              <w:t>Industrial Revolution: Positive Feedback</w:t>
-            </w:r>
-            <w:r>
-              <w:rPr>
-                <w:rFonts w:ascii="Arial" w:eastAsia="Times New Roman" w:hAnsi="Arial" w:cs="Arial"/>
-                <w:bCs/>
-                <w:spacing w:val="-5"/>
-                <w:sz w:val="24"/>
-                <w:szCs w:val="20"/>
-              </w:rPr>
-              <w:t xml:space="preserve"> </w:t>
-            </w:r>
-            <w:r>
-              <w:rPr>
-                <w:rFonts w:ascii="Arial" w:eastAsia="Times New Roman" w:hAnsi="Arial" w:cs="Arial"/>
-                <w:bCs/>
-                <w:spacing w:val="-5"/>
-                <w:sz w:val="24"/>
-                <w:szCs w:val="20"/>
-              </w:rPr>
-              <w:t>Between Smith-Young Growth</w:t>
-            </w:r>
-            <w:r>
-              <w:rPr>
-                <w:rFonts w:ascii="Arial" w:eastAsia="Times New Roman" w:hAnsi="Arial" w:cs="Arial"/>
-                <w:bCs/>
-                <w:spacing w:val="-5"/>
-                <w:sz w:val="24"/>
-                <w:szCs w:val="20"/>
-              </w:rPr>
-              <w:t xml:space="preserve"> </w:t>
-            </w:r>
-            <w:r>
-              <w:rPr>
-                <w:rFonts w:ascii="Arial" w:eastAsia="Times New Roman" w:hAnsi="Arial" w:cs="Arial"/>
-                <w:bCs/>
-                <w:spacing w:val="-5"/>
-                <w:sz w:val="24"/>
-                <w:szCs w:val="20"/>
-              </w:rPr>
-              <w:t>and Schumpeterian Growth</w:t>
+              <w:t>Industrial Revolution: Positive Feedback Between Smith-Young Growth and Schumpeterian Growth</w:t>
+            </w:r>
+            <w:r>
+              <w:rPr>
+                <w:rFonts w:ascii="Arial" w:eastAsia="Times New Roman" w:hAnsi="Arial" w:cs="Arial"/>
+                <w:bCs/>
+                <w:spacing w:val="-5"/>
+                <w:sz w:val="24"/>
+                <w:szCs w:val="20"/>
+              </w:rPr>
+              <w:t>jnderst</w:t>
             </w:r>
           </w:p>
         </w:tc>
@@ -2020,27 +1966,15 @@
               </w:rPr>
               <w:t xml:space="preserve">and </w:t>
             </w:r>
-            <w:proofErr w:type="gramStart"/>
-            <w:r>
-              <w:rPr>
-                <w:rFonts w:ascii="Arial" w:eastAsia="Times New Roman" w:hAnsi="Arial" w:cs="Arial"/>
-                <w:b/>
-                <w:sz w:val="24"/>
-                <w:szCs w:val="20"/>
-                <w:lang w:eastAsia="en-GB"/>
-              </w:rPr>
-              <w:t>Higher level</w:t>
-            </w:r>
-            <w:proofErr w:type="gramEnd"/>
-            <w:r>
-              <w:rPr>
-                <w:rFonts w:ascii="Arial" w:eastAsia="Times New Roman" w:hAnsi="Arial" w:cs="Arial"/>
-                <w:b/>
-                <w:sz w:val="24"/>
-                <w:szCs w:val="20"/>
-                <w:lang w:eastAsia="en-GB"/>
-              </w:rPr>
-              <w:t xml:space="preserve"> clearance</w:t>
+            <w:r>
+              <w:rPr>
+                <w:rFonts w:ascii="Arial" w:eastAsia="Times New Roman" w:hAnsi="Arial" w:cs="Arial"/>
+                <w:b/>
+                <w:sz w:val="24"/>
+                <w:szCs w:val="20"/>
+                <w:lang w:eastAsia="en-GB"/>
+              </w:rPr>
+              <w:t>Higher level clearance</w:t>
             </w:r>
           </w:p>
         </w:tc>
@@ -2296,31 +2230,7 @@
                       <w:szCs w:val="20"/>
                       <w:lang w:eastAsia="en-GB"/>
                     </w:rPr>
-                    <w:t xml:space="preserve">f </w:t>
-                  </w:r>
-                  <w:proofErr w:type="gramStart"/>
-                  <w:r>
-                    <w:rPr>
-                      <w:rFonts w:ascii="Arial" w:eastAsia="Times New Roman" w:hAnsi="Arial" w:cs="Arial"/>
-                      <w:i/>
-                      <w:iCs/>
-                      <w:sz w:val="24"/>
-                      <w:szCs w:val="20"/>
-                      <w:lang w:eastAsia="en-GB"/>
-                    </w:rPr>
-                    <w:t>so</w:t>
-                  </w:r>
-                  <w:proofErr w:type="gramEnd"/>
-                  <w:r>
-                    <w:rPr>
-                      <w:rFonts w:ascii="Arial" w:eastAsia="Times New Roman" w:hAnsi="Arial" w:cs="Arial"/>
-                      <w:i/>
-                      <w:iCs/>
-                      <w:sz w:val="24"/>
-                      <w:szCs w:val="20"/>
-                      <w:lang w:eastAsia="en-GB"/>
-                    </w:rPr>
-                    <w:t xml:space="preserve"> please complete Form A below</w:t>
+                    <w:t>f so please complete Form A below</w:t>
                   </w:r>
                 </w:p>
               </w:tc>
@@ -2428,31 +2338,7 @@
                       <w:szCs w:val="20"/>
                       <w:lang w:eastAsia="en-GB"/>
                     </w:rPr>
-                    <w:t xml:space="preserve">If </w:t>
-                  </w:r>
-                  <w:proofErr w:type="gramStart"/>
-                  <w:r>
-                    <w:rPr>
-                      <w:rFonts w:ascii="Arial" w:eastAsia="Times New Roman" w:hAnsi="Arial" w:cs="Arial"/>
-                      <w:i/>
-                      <w:iCs/>
-                      <w:sz w:val="24"/>
-                      <w:szCs w:val="20"/>
-                      <w:lang w:eastAsia="en-GB"/>
-                    </w:rPr>
-                    <w:t>so</w:t>
-                  </w:r>
-                  <w:proofErr w:type="gramEnd"/>
-                  <w:r>
-                    <w:rPr>
-                      <w:rFonts w:ascii="Arial" w:eastAsia="Times New Roman" w:hAnsi="Arial" w:cs="Arial"/>
-                      <w:i/>
-                      <w:iCs/>
-                      <w:sz w:val="24"/>
-                      <w:szCs w:val="20"/>
-                      <w:lang w:eastAsia="en-GB"/>
-                    </w:rPr>
-                    <w:t xml:space="preserve"> please complete Form B below</w:t>
+                    <w:t>If so please complete Form B below</w:t>
                   </w:r>
                 </w:p>
               </w:tc>
@@ -3055,27 +2941,7 @@
                 <w:szCs w:val="20"/>
                 <w:lang w:eastAsia="en-GB"/>
               </w:rPr>
-              <w:t>Invasive studies (</w:t>
-            </w:r>
-            <w:proofErr w:type="spellStart"/>
-            <w:r>
-              <w:rPr>
-                <w:rFonts w:ascii="Arial" w:eastAsia="Times New Roman" w:hAnsi="Arial" w:cs="Arial"/>
-                <w:sz w:val="24"/>
-                <w:szCs w:val="20"/>
-                <w:lang w:eastAsia="en-GB"/>
-              </w:rPr>
-              <w:t>ie</w:t>
-            </w:r>
-            <w:proofErr w:type="spellEnd"/>
-            <w:r>
-              <w:rPr>
-                <w:rFonts w:ascii="Arial" w:eastAsia="Times New Roman" w:hAnsi="Arial" w:cs="Arial"/>
-                <w:sz w:val="24"/>
-                <w:szCs w:val="20"/>
-                <w:lang w:eastAsia="en-GB"/>
-              </w:rPr>
-              <w:t>. blood samples)</w:t>
+              <w:t>Invasive studies (ie. blood samples)</w:t>
             </w:r>
           </w:p>
         </w:tc>
@@ -3374,27 +3240,7 @@
                 <w:szCs w:val="20"/>
                 <w:lang w:eastAsia="en-GB"/>
               </w:rPr>
-              <w:t xml:space="preserve">If any of these aspects are being </w:t>
-            </w:r>
-            <w:proofErr w:type="gramStart"/>
-            <w:r>
-              <w:rPr>
-                <w:rFonts w:ascii="Arial" w:eastAsia="Times New Roman" w:hAnsi="Arial" w:cs="Arial"/>
-                <w:sz w:val="24"/>
-                <w:szCs w:val="20"/>
-                <w:lang w:eastAsia="en-GB"/>
-              </w:rPr>
-              <w:t>studied</w:t>
-            </w:r>
-            <w:proofErr w:type="gramEnd"/>
-            <w:r>
-              <w:rPr>
-                <w:rFonts w:ascii="Arial" w:eastAsia="Times New Roman" w:hAnsi="Arial" w:cs="Arial"/>
-                <w:sz w:val="24"/>
-                <w:szCs w:val="20"/>
-                <w:lang w:eastAsia="en-GB"/>
-              </w:rPr>
-              <w:t xml:space="preserve"> please refer to the </w:t>
+              <w:t xml:space="preserve">If any of these aspects are being studied please refer to the </w:t>
             </w:r>
             <w:r>
               <w:rPr>
@@ -3413,27 +3259,7 @@
                 <w:szCs w:val="20"/>
                 <w:lang w:eastAsia="en-GB"/>
               </w:rPr>
-              <w:t xml:space="preserve"> </w:t>
-            </w:r>
-            <w:proofErr w:type="gramStart"/>
-            <w:r>
-              <w:rPr>
-                <w:rFonts w:ascii="Arial" w:eastAsia="Times New Roman" w:hAnsi="Arial" w:cs="Arial"/>
-                <w:sz w:val="24"/>
-                <w:szCs w:val="20"/>
-                <w:lang w:eastAsia="en-GB"/>
-              </w:rPr>
-              <w:t>in order to</w:t>
-            </w:r>
-            <w:proofErr w:type="gramEnd"/>
-            <w:r>
-              <w:rPr>
-                <w:rFonts w:ascii="Arial" w:eastAsia="Times New Roman" w:hAnsi="Arial" w:cs="Arial"/>
-                <w:sz w:val="24"/>
-                <w:szCs w:val="20"/>
-                <w:lang w:eastAsia="en-GB"/>
-              </w:rPr>
-              <w:t xml:space="preserve"> identify what supplementary paperwork must be included.</w:t>
+              <w:t xml:space="preserve"> in order to identify what supplementary paperwork must be included.</w:t>
             </w:r>
           </w:p>
           <w:p>
@@ -3598,118 +3424,38 @@
                 <w:szCs w:val="20"/>
                 <w:lang w:eastAsia="en-GB"/>
               </w:rPr>
-              <w:t xml:space="preserve">Lecturer </w:t>
-            </w:r>
-            <w:proofErr w:type="gramStart"/>
-            <w:r>
-              <w:rPr>
-                <w:rFonts w:ascii="Arial" w:eastAsia="Times New Roman" w:hAnsi="Arial" w:cs="Arial"/>
-                <w:sz w:val="24"/>
-                <w:szCs w:val="20"/>
-                <w:lang w:eastAsia="en-GB"/>
-              </w:rPr>
-              <w:t>Signed:_</w:t>
-            </w:r>
-            <w:proofErr w:type="gramEnd"/>
-            <w:r>
-              <w:rPr>
-                <w:rFonts w:ascii="Arial" w:eastAsia="Times New Roman" w:hAnsi="Arial" w:cs="Arial"/>
-                <w:sz w:val="24"/>
-                <w:szCs w:val="20"/>
-                <w:lang w:eastAsia="en-GB"/>
-              </w:rPr>
-              <w:t>_________________________</w:t>
-            </w:r>
-            <w:proofErr w:type="gramStart"/>
-            <w:r>
-              <w:rPr>
-                <w:rFonts w:ascii="Arial" w:eastAsia="Times New Roman" w:hAnsi="Arial" w:cs="Arial"/>
-                <w:sz w:val="24"/>
-                <w:szCs w:val="20"/>
-                <w:lang w:eastAsia="en-GB"/>
-              </w:rPr>
-              <w:t>_  dated</w:t>
-            </w:r>
-            <w:proofErr w:type="gramEnd"/>
-            <w:r>
-              <w:rPr>
-                <w:rFonts w:ascii="Arial" w:eastAsia="Times New Roman" w:hAnsi="Arial" w:cs="Arial"/>
-                <w:sz w:val="24"/>
-                <w:szCs w:val="20"/>
-                <w:lang w:eastAsia="en-GB"/>
-              </w:rPr>
-              <w:t>: _____________________</w:t>
-            </w:r>
-          </w:p>
-          <w:p>
-            <w:pPr>
-              <w:spacing w:after="0" w:line="240" w:lineRule="auto"/>
-              <w:rPr>
-                <w:rFonts w:ascii="Arial" w:eastAsia="Times New Roman" w:hAnsi="Arial" w:cs="Arial"/>
-                <w:sz w:val="24"/>
-                <w:szCs w:val="20"/>
-                <w:lang w:eastAsia="en-GB"/>
-              </w:rPr>
-            </w:pPr>
-          </w:p>
-          <w:p>
-            <w:pPr>
-              <w:spacing w:after="0" w:line="240" w:lineRule="auto"/>
-              <w:rPr>
-                <w:rFonts w:ascii="Arial" w:eastAsia="Times New Roman" w:hAnsi="Arial" w:cs="Arial"/>
-                <w:sz w:val="24"/>
-                <w:szCs w:val="20"/>
-                <w:lang w:eastAsia="en-GB"/>
-              </w:rPr>
-            </w:pPr>
-            <w:r>
-              <w:rPr>
-                <w:rFonts w:ascii="Arial" w:eastAsia="Times New Roman" w:hAnsi="Arial" w:cs="Arial"/>
-                <w:sz w:val="24"/>
-                <w:szCs w:val="20"/>
-                <w:lang w:eastAsia="en-GB"/>
-              </w:rPr>
-              <w:t xml:space="preserve">Supervisor </w:t>
-            </w:r>
-            <w:proofErr w:type="gramStart"/>
-            <w:r>
-              <w:rPr>
-                <w:rFonts w:ascii="Arial" w:eastAsia="Times New Roman" w:hAnsi="Arial" w:cs="Arial"/>
-                <w:sz w:val="24"/>
-                <w:szCs w:val="20"/>
-                <w:lang w:eastAsia="en-GB"/>
-              </w:rPr>
-              <w:t>Signed:_</w:t>
-            </w:r>
-            <w:proofErr w:type="gramEnd"/>
-            <w:r>
-              <w:rPr>
-                <w:rFonts w:ascii="Arial" w:eastAsia="Times New Roman" w:hAnsi="Arial" w:cs="Arial"/>
-                <w:sz w:val="24"/>
-                <w:szCs w:val="20"/>
-                <w:lang w:eastAsia="en-GB"/>
-              </w:rPr>
-              <w:t>_______________________</w:t>
-            </w:r>
-            <w:proofErr w:type="gramStart"/>
-            <w:r>
-              <w:rPr>
-                <w:rFonts w:ascii="Arial" w:eastAsia="Times New Roman" w:hAnsi="Arial" w:cs="Arial"/>
-                <w:sz w:val="24"/>
-                <w:szCs w:val="20"/>
-                <w:lang w:eastAsia="en-GB"/>
-              </w:rPr>
-              <w:t>_  dated</w:t>
-            </w:r>
-            <w:proofErr w:type="gramEnd"/>
-            <w:r>
-              <w:rPr>
-                <w:rFonts w:ascii="Arial" w:eastAsia="Times New Roman" w:hAnsi="Arial" w:cs="Arial"/>
-                <w:sz w:val="24"/>
-                <w:szCs w:val="20"/>
-                <w:lang w:eastAsia="en-GB"/>
-              </w:rPr>
-              <w:t>: ______________________</w:t>
+              <w:t>Lecturer Signed:___________________________  dated: _____________________</w:t>
+            </w:r>
+          </w:p>
+          <w:p>
+            <w:pPr>
+              <w:spacing w:after="0" w:line="240" w:lineRule="auto"/>
+              <w:rPr>
+                <w:rFonts w:ascii="Arial" w:eastAsia="Times New Roman" w:hAnsi="Arial" w:cs="Arial"/>
+                <w:sz w:val="24"/>
+                <w:szCs w:val="20"/>
+                <w:lang w:eastAsia="en-GB"/>
+              </w:rPr>
+            </w:pPr>
+          </w:p>
+          <w:p>
+            <w:pPr>
+              <w:spacing w:after="0" w:line="240" w:lineRule="auto"/>
+              <w:rPr>
+                <w:rFonts w:ascii="Arial" w:eastAsia="Times New Roman" w:hAnsi="Arial" w:cs="Arial"/>
+                <w:sz w:val="24"/>
+                <w:szCs w:val="20"/>
+                <w:lang w:eastAsia="en-GB"/>
+              </w:rPr>
+            </w:pPr>
+            <w:r>
+              <w:rPr>
+                <w:rFonts w:ascii="Arial" w:eastAsia="Times New Roman" w:hAnsi="Arial" w:cs="Arial"/>
+                <w:sz w:val="24"/>
+                <w:szCs w:val="20"/>
+                <w:lang w:eastAsia="en-GB"/>
+              </w:rPr>
+              <w:t>Supervisor Signed:_________________________  dated: ______________________</w:t>
             </w:r>
           </w:p>
           <w:p>
@@ -3929,87 +3675,45 @@
                 <w:lang w:eastAsia="en-GB"/>
               </w:rPr>
             </w:pPr>
-            <w:proofErr w:type="gramStart"/>
-            <w:r>
-              <w:rPr>
-                <w:rFonts w:ascii="Arial" w:eastAsia="Times New Roman" w:hAnsi="Arial" w:cs="Arial"/>
-                <w:sz w:val="24"/>
-                <w:szCs w:val="20"/>
-                <w:lang w:eastAsia="en-GB"/>
-              </w:rPr>
-              <w:t>Signed:_</w:t>
-            </w:r>
-            <w:proofErr w:type="gramEnd"/>
-            <w:r>
-              <w:rPr>
-                <w:rFonts w:ascii="Arial" w:eastAsia="Times New Roman" w:hAnsi="Arial" w:cs="Arial"/>
-                <w:sz w:val="24"/>
-                <w:szCs w:val="20"/>
-                <w:lang w:eastAsia="en-GB"/>
-              </w:rPr>
-              <w:t>_________________________________</w:t>
-            </w:r>
-            <w:proofErr w:type="gramStart"/>
-            <w:r>
-              <w:rPr>
-                <w:rFonts w:ascii="Arial" w:eastAsia="Times New Roman" w:hAnsi="Arial" w:cs="Arial"/>
-                <w:sz w:val="24"/>
-                <w:szCs w:val="20"/>
-                <w:lang w:eastAsia="en-GB"/>
-              </w:rPr>
-              <w:t>_  Programme</w:t>
-            </w:r>
-            <w:proofErr w:type="gramEnd"/>
-            <w:r>
-              <w:rPr>
-                <w:rFonts w:ascii="Arial" w:eastAsia="Times New Roman" w:hAnsi="Arial" w:cs="Arial"/>
-                <w:sz w:val="24"/>
-                <w:szCs w:val="20"/>
-                <w:lang w:eastAsia="en-GB"/>
-              </w:rPr>
-              <w:t>/Module Leader</w:t>
-            </w:r>
-          </w:p>
-          <w:p>
-            <w:pPr>
-              <w:spacing w:after="0" w:line="240" w:lineRule="auto"/>
-              <w:rPr>
-                <w:rFonts w:ascii="Arial" w:eastAsia="Times New Roman" w:hAnsi="Arial" w:cs="Arial"/>
-                <w:sz w:val="24"/>
-                <w:szCs w:val="20"/>
-                <w:lang w:eastAsia="en-GB"/>
-              </w:rPr>
-            </w:pPr>
-          </w:p>
-          <w:p>
-            <w:pPr>
-              <w:spacing w:after="0" w:line="240" w:lineRule="auto"/>
-              <w:rPr>
-                <w:rFonts w:ascii="Arial" w:eastAsia="Times New Roman" w:hAnsi="Arial" w:cs="Arial"/>
-                <w:sz w:val="24"/>
-                <w:szCs w:val="20"/>
-                <w:lang w:eastAsia="en-GB"/>
-              </w:rPr>
-            </w:pPr>
-            <w:proofErr w:type="gramStart"/>
-            <w:r>
-              <w:rPr>
-                <w:rFonts w:ascii="Arial" w:eastAsia="Times New Roman" w:hAnsi="Arial" w:cs="Arial"/>
-                <w:sz w:val="24"/>
-                <w:szCs w:val="20"/>
-                <w:lang w:eastAsia="en-GB"/>
-              </w:rPr>
-              <w:t>Signed:_</w:t>
-            </w:r>
-            <w:proofErr w:type="gramEnd"/>
-            <w:r>
-              <w:rPr>
-                <w:rFonts w:ascii="Arial" w:eastAsia="Times New Roman" w:hAnsi="Arial" w:cs="Arial"/>
-                <w:sz w:val="24"/>
-                <w:szCs w:val="20"/>
-                <w:lang w:eastAsia="en-GB"/>
-              </w:rPr>
-              <w:t>__________________________________ Critical friend</w:t>
+            <w:r>
+              <w:rPr>
+                <w:rFonts w:ascii="Arial" w:eastAsia="Times New Roman" w:hAnsi="Arial" w:cs="Arial"/>
+                <w:sz w:val="24"/>
+                <w:szCs w:val="20"/>
+                <w:lang w:eastAsia="en-GB"/>
+              </w:rPr>
+              <w:t>Signed:___________________________________  Programme/Module Leader</w:t>
+            </w:r>
+          </w:p>
+          <w:p>
+            <w:pPr>
+              <w:spacing w:after="0" w:line="240" w:lineRule="auto"/>
+              <w:rPr>
+                <w:rFonts w:ascii="Arial" w:eastAsia="Times New Roman" w:hAnsi="Arial" w:cs="Arial"/>
+                <w:sz w:val="24"/>
+                <w:szCs w:val="20"/>
+                <w:lang w:eastAsia="en-GB"/>
+              </w:rPr>
+            </w:pPr>
+          </w:p>
+          <w:p>
+            <w:pPr>
+              <w:spacing w:after="0" w:line="240" w:lineRule="auto"/>
+              <w:rPr>
+                <w:rFonts w:ascii="Arial" w:eastAsia="Times New Roman" w:hAnsi="Arial" w:cs="Arial"/>
+                <w:sz w:val="24"/>
+                <w:szCs w:val="20"/>
+                <w:lang w:eastAsia="en-GB"/>
+              </w:rPr>
+            </w:pPr>
+            <w:r>
+              <w:rPr>
+                <w:rFonts w:ascii="Arial" w:eastAsia="Times New Roman" w:hAnsi="Arial" w:cs="Arial"/>
+                <w:sz w:val="24"/>
+                <w:szCs w:val="20"/>
+                <w:lang w:eastAsia="en-GB"/>
+              </w:rPr>
+              <w:t>Signed:___________________________________ Critical friend</w:t>
             </w:r>
           </w:p>
           <w:p>
@@ -4249,107 +3953,56 @@
                 <w:lang w:eastAsia="en-GB"/>
               </w:rPr>
             </w:pPr>
-            <w:proofErr w:type="gramStart"/>
-            <w:r>
-              <w:rPr>
-                <w:rFonts w:ascii="Arial" w:eastAsia="Times New Roman" w:hAnsi="Arial" w:cs="Arial"/>
-                <w:sz w:val="24"/>
-                <w:szCs w:val="20"/>
-                <w:lang w:eastAsia="en-GB"/>
-              </w:rPr>
-              <w:t>Signed:_</w:t>
-            </w:r>
-            <w:proofErr w:type="gramEnd"/>
-            <w:r>
-              <w:rPr>
-                <w:rFonts w:ascii="Arial" w:eastAsia="Times New Roman" w:hAnsi="Arial" w:cs="Arial"/>
-                <w:sz w:val="24"/>
-                <w:szCs w:val="20"/>
-                <w:lang w:eastAsia="en-GB"/>
-              </w:rPr>
-              <w:t>_________________________________</w:t>
-            </w:r>
-            <w:proofErr w:type="gramStart"/>
-            <w:r>
-              <w:rPr>
-                <w:rFonts w:ascii="Arial" w:eastAsia="Times New Roman" w:hAnsi="Arial" w:cs="Arial"/>
-                <w:sz w:val="24"/>
-                <w:szCs w:val="20"/>
-                <w:lang w:eastAsia="en-GB"/>
-              </w:rPr>
-              <w:t>_  Ethics</w:t>
-            </w:r>
-            <w:proofErr w:type="gramEnd"/>
-            <w:r>
-              <w:rPr>
-                <w:rFonts w:ascii="Arial" w:eastAsia="Times New Roman" w:hAnsi="Arial" w:cs="Arial"/>
-                <w:sz w:val="24"/>
-                <w:szCs w:val="20"/>
-                <w:lang w:eastAsia="en-GB"/>
-              </w:rPr>
-              <w:t xml:space="preserve"> Board Chair or nominee</w:t>
-            </w:r>
-          </w:p>
-          <w:p>
-            <w:pPr>
-              <w:spacing w:after="0" w:line="240" w:lineRule="auto"/>
-              <w:rPr>
-                <w:rFonts w:ascii="Arial" w:eastAsia="Times New Roman" w:hAnsi="Arial" w:cs="Arial"/>
-                <w:sz w:val="24"/>
-                <w:szCs w:val="20"/>
-                <w:lang w:eastAsia="en-GB"/>
-              </w:rPr>
-            </w:pPr>
-          </w:p>
-          <w:p>
-            <w:pPr>
-              <w:spacing w:after="0" w:line="240" w:lineRule="auto"/>
-              <w:rPr>
-                <w:rFonts w:ascii="Arial" w:eastAsia="Times New Roman" w:hAnsi="Arial" w:cs="Arial"/>
-                <w:sz w:val="24"/>
-                <w:szCs w:val="20"/>
-                <w:lang w:eastAsia="en-GB"/>
-              </w:rPr>
-            </w:pPr>
-          </w:p>
-          <w:p>
-            <w:pPr>
-              <w:spacing w:after="0" w:line="240" w:lineRule="auto"/>
-              <w:rPr>
-                <w:rFonts w:ascii="Arial" w:eastAsia="Times New Roman" w:hAnsi="Arial" w:cs="Arial"/>
-                <w:sz w:val="24"/>
-                <w:szCs w:val="20"/>
-                <w:lang w:eastAsia="en-GB"/>
-              </w:rPr>
-            </w:pPr>
-            <w:r>
-              <w:rPr>
-                <w:rFonts w:ascii="Arial" w:eastAsia="Times New Roman" w:hAnsi="Arial" w:cs="Arial"/>
-                <w:sz w:val="24"/>
-                <w:szCs w:val="20"/>
-                <w:lang w:eastAsia="en-GB"/>
-              </w:rPr>
-              <w:t xml:space="preserve">Date of </w:t>
-            </w:r>
-            <w:proofErr w:type="gramStart"/>
-            <w:r>
-              <w:rPr>
-                <w:rFonts w:ascii="Arial" w:eastAsia="Times New Roman" w:hAnsi="Arial" w:cs="Arial"/>
-                <w:sz w:val="24"/>
-                <w:szCs w:val="20"/>
-                <w:lang w:eastAsia="en-GB"/>
-              </w:rPr>
-              <w:t>Board:_</w:t>
-            </w:r>
-            <w:proofErr w:type="gramEnd"/>
-            <w:r>
-              <w:rPr>
-                <w:rFonts w:ascii="Arial" w:eastAsia="Times New Roman" w:hAnsi="Arial" w:cs="Arial"/>
-                <w:sz w:val="24"/>
-                <w:szCs w:val="20"/>
-                <w:lang w:eastAsia="en-GB"/>
-              </w:rPr>
-              <w:t>__________________</w:t>
+            <w:r>
+              <w:rPr>
+                <w:rFonts w:ascii="Arial" w:eastAsia="Times New Roman" w:hAnsi="Arial" w:cs="Arial"/>
+                <w:sz w:val="24"/>
+                <w:szCs w:val="20"/>
+                <w:lang w:eastAsia="en-GB"/>
+              </w:rPr>
+              <w:t>Signed:___________________________________  Ethics Board Chair or nominee</w:t>
+            </w:r>
+          </w:p>
+          <w:p>
+            <w:pPr>
+              <w:spacing w:after="0" w:line="240" w:lineRule="auto"/>
+              <w:rPr>
+                <w:rFonts w:ascii="Arial" w:eastAsia="Times New Roman" w:hAnsi="Arial" w:cs="Arial"/>
+                <w:sz w:val="24"/>
+                <w:szCs w:val="20"/>
+                <w:lang w:eastAsia="en-GB"/>
+              </w:rPr>
+            </w:pPr>
+          </w:p>
+          <w:p>
+            <w:pPr>
+              <w:spacing w:after="0" w:line="240" w:lineRule="auto"/>
+              <w:rPr>
+                <w:rFonts w:ascii="Arial" w:eastAsia="Times New Roman" w:hAnsi="Arial" w:cs="Arial"/>
+                <w:sz w:val="24"/>
+                <w:szCs w:val="20"/>
+                <w:lang w:eastAsia="en-GB"/>
+              </w:rPr>
+            </w:pPr>
+          </w:p>
+          <w:p>
+            <w:pPr>
+              <w:spacing w:after="0" w:line="240" w:lineRule="auto"/>
+              <w:rPr>
+                <w:rFonts w:ascii="Arial" w:eastAsia="Times New Roman" w:hAnsi="Arial" w:cs="Arial"/>
+                <w:sz w:val="24"/>
+                <w:szCs w:val="20"/>
+                <w:lang w:eastAsia="en-GB"/>
+              </w:rPr>
+            </w:pPr>
+            <w:r>
+              <w:rPr>
+                <w:rFonts w:ascii="Arial" w:eastAsia="Times New Roman" w:hAnsi="Arial" w:cs="Arial"/>
+                <w:sz w:val="24"/>
+                <w:szCs w:val="20"/>
+                <w:lang w:eastAsia="en-GB"/>
+              </w:rPr>
+              <w:t>Date of Board:___________________</w:t>
             </w:r>
           </w:p>
           <w:p>
@@ -7599,6 +7252,7 @@
   <w:style w:type="character" w:default="1" w:styleId="DefaultParagraphFont">
     <w:name w:val="Default Paragraph Font"/>
     <w:uiPriority w:val="1"/>
+    <w:semiHidden/>
     <w:unhideWhenUsed/>
   </w:style>
   <w:style w:type="table" w:default="1" w:styleId="TableNormal">
@@ -7953,6 +7607,27 @@
 </file>
 
 <file path=customXml/item1.xml><?xml version="1.0" encoding="utf-8"?>
+<?mso-contentType ?>
+<FormTemplates xmlns="http://schemas.microsoft.com/sharepoint/v3/contenttype/forms">
+  <Display>DocumentLibraryForm</Display>
+  <Edit>DocumentLibraryForm</Edit>
+  <New>DocumentLibraryForm</New>
+</FormTemplates>
+</file>
+
+<file path=customXml/item2.xml><?xml version="1.0" encoding="utf-8"?>
+<p:properties xmlns:p="http://schemas.microsoft.com/office/2006/metadata/properties" xmlns:xsi="http://www.w3.org/2001/XMLSchema-instance" xmlns:pc="http://schemas.microsoft.com/office/infopath/2007/PartnerControls">
+  <documentManagement>
+    <lcf76f155ced4ddcb4097134ff3c332f xmlns="3e2b065d-a076-4537-88ca-8a0675b8bc9b">
+      <Terms xmlns="http://schemas.microsoft.com/office/infopath/2007/PartnerControls"/>
+    </lcf76f155ced4ddcb4097134ff3c332f>
+    <TaxCatchAll xmlns="84925e4f-3fb8-4c75-975f-9f0d1695fe1f" xsi:nil="true"/>
+    <paper xmlns="3e2b065d-a076-4537-88ca-8a0675b8bc9b" xsi:nil="true"/>
+  </documentManagement>
+</p:properties>
+</file>
+
+<file path=customXml/item3.xml><?xml version="1.0" encoding="utf-8"?>
 <ct:contentTypeSchema xmlns:ct="http://schemas.microsoft.com/office/2006/metadata/contentType" xmlns:ma="http://schemas.microsoft.com/office/2006/metadata/properties/metaAttributes" ct:_="" ma:_="" ma:contentTypeName="Document" ma:contentTypeID="0x010100FE310FD10B80144F99F1F9DD47F6B86A" ma:contentTypeVersion="19" ma:contentTypeDescription="Create a new document." ma:contentTypeScope="" ma:versionID="d1e7a9894d01a5458c2dece1bc1b3d3c">
   <xsd:schema xmlns:xsd="http://www.w3.org/2001/XMLSchema" xmlns:xs="http://www.w3.org/2001/XMLSchema" xmlns:p="http://schemas.microsoft.com/office/2006/metadata/properties" xmlns:ns2="3e2b065d-a076-4537-88ca-8a0675b8bc9b" xmlns:ns3="84925e4f-3fb8-4c75-975f-9f0d1695fe1f" targetNamespace="http://schemas.microsoft.com/office/2006/metadata/properties" ma:root="true" ma:fieldsID="e4579e9f09947bd46d139c3e605ca39f" ns2:_="" ns3:_="">
     <xsd:import namespace="3e2b065d-a076-4537-88ca-8a0675b8bc9b"/>
@@ -8215,28 +7890,26 @@
 </ct:contentTypeSchema>
 </file>
 
-<file path=customXml/item2.xml><?xml version="1.0" encoding="utf-8"?>
-<p:properties xmlns:p="http://schemas.microsoft.com/office/2006/metadata/properties" xmlns:xsi="http://www.w3.org/2001/XMLSchema-instance" xmlns:pc="http://schemas.microsoft.com/office/infopath/2007/PartnerControls">
-  <documentManagement>
-    <lcf76f155ced4ddcb4097134ff3c332f xmlns="3e2b065d-a076-4537-88ca-8a0675b8bc9b">
-      <Terms xmlns="http://schemas.microsoft.com/office/infopath/2007/PartnerControls"/>
-    </lcf76f155ced4ddcb4097134ff3c332f>
-    <TaxCatchAll xmlns="84925e4f-3fb8-4c75-975f-9f0d1695fe1f" xsi:nil="true"/>
-    <paper xmlns="3e2b065d-a076-4537-88ca-8a0675b8bc9b" xsi:nil="true"/>
-  </documentManagement>
-</p:properties>
+<file path=customXml/itemProps1.xml><?xml version="1.0" encoding="utf-8"?>
+<ds:datastoreItem xmlns:ds="http://schemas.openxmlformats.org/officeDocument/2006/customXml" ds:itemID="{659E89AC-594A-4620-BC2E-F2166A62CE0C}">
+  <ds:schemaRefs>
+    <ds:schemaRef ds:uri="http://schemas.microsoft.com/sharepoint/v3/contenttype/forms"/>
+  </ds:schemaRefs>
+</ds:datastoreItem>
 </file>
 
-<file path=customXml/item3.xml><?xml version="1.0" encoding="utf-8"?>
-<?mso-contentType ?>
-<FormTemplates xmlns="http://schemas.microsoft.com/sharepoint/v3/contenttype/forms">
-  <Display>DocumentLibraryForm</Display>
-  <Edit>DocumentLibraryForm</Edit>
-  <New>DocumentLibraryForm</New>
-</FormTemplates>
+<file path=customXml/itemProps2.xml><?xml version="1.0" encoding="utf-8"?>
+<ds:datastoreItem xmlns:ds="http://schemas.openxmlformats.org/officeDocument/2006/customXml" ds:itemID="{047389C6-07B6-4D36-928B-24FE7A401117}">
+  <ds:schemaRefs>
+    <ds:schemaRef ds:uri="http://schemas.microsoft.com/office/2006/metadata/properties"/>
+    <ds:schemaRef ds:uri="http://schemas.microsoft.com/office/infopath/2007/PartnerControls"/>
+    <ds:schemaRef ds:uri="3e2b065d-a076-4537-88ca-8a0675b8bc9b"/>
+    <ds:schemaRef ds:uri="84925e4f-3fb8-4c75-975f-9f0d1695fe1f"/>
+  </ds:schemaRefs>
+</ds:datastoreItem>
 </file>
 
-<file path=customXml/itemProps1.xml><?xml version="1.0" encoding="utf-8"?>
+<file path=customXml/itemProps3.xml><?xml version="1.0" encoding="utf-8"?>
 <ds:datastoreItem xmlns:ds="http://schemas.openxmlformats.org/officeDocument/2006/customXml" ds:itemID="{1F496BED-4A14-4900-98DA-C760CCAA0BFA}">
   <ds:schemaRefs>
     <ds:schemaRef ds:uri="http://schemas.microsoft.com/office/2006/metadata/contentType"/>
@@ -8255,25 +7928,6 @@
 </ds:datastoreItem>
 </file>
 
-<file path=customXml/itemProps2.xml><?xml version="1.0" encoding="utf-8"?>
-<ds:datastoreItem xmlns:ds="http://schemas.openxmlformats.org/officeDocument/2006/customXml" ds:itemID="{047389C6-07B6-4D36-928B-24FE7A401117}">
-  <ds:schemaRefs>
-    <ds:schemaRef ds:uri="http://schemas.microsoft.com/office/2006/metadata/properties"/>
-    <ds:schemaRef ds:uri="http://schemas.microsoft.com/office/infopath/2007/PartnerControls"/>
-    <ds:schemaRef ds:uri="3e2b065d-a076-4537-88ca-8a0675b8bc9b"/>
-    <ds:schemaRef ds:uri="84925e4f-3fb8-4c75-975f-9f0d1695fe1f"/>
-  </ds:schemaRefs>
-</ds:datastoreItem>
-</file>
-
-<file path=customXml/itemProps3.xml><?xml version="1.0" encoding="utf-8"?>
-<ds:datastoreItem xmlns:ds="http://schemas.openxmlformats.org/officeDocument/2006/customXml" ds:itemID="{659E89AC-594A-4620-BC2E-F2166A62CE0C}">
-  <ds:schemaRefs>
-    <ds:schemaRef ds:uri="http://schemas.microsoft.com/sharepoint/v3/contenttype/forms"/>
-  </ds:schemaRefs>
-</ds:datastoreItem>
-</file>
-
 <file path=docMetadata/LabelInfo.xml><?xml version="1.0" encoding="utf-8"?>
 <clbl:labelList xmlns:clbl="http://schemas.microsoft.com/office/2020/mipLabelMetadata">
   <clbl:label id="{f07f5b33-23af-4db2-91d3-9f677b1a5834}" enabled="1" method="Standard" siteId="{08ea6e35-fc1e-442b-8d5d-fb64c27ffa09}" removed="0"/>

</xml_diff>